<commit_message>
chore(main):Mise en place de l'application flashcards
[Done][35]
</commit_message>
<xml_diff>
--- a/doc/P_Bulle_Dev-Flashcards.docx
+++ b/doc/P_Bulle_Dev-Flashcards.docx
@@ -1,6 +1,6 @@
 
 <file path=word/document.xml><?xml version="1.0" encoding="utf-8"?>
-<w:document xmlns:wpc="http://schemas.microsoft.com/office/word/2010/wordprocessingCanvas" xmlns:cx="http://schemas.microsoft.com/office/drawing/2014/chartex" xmlns:cx1="http://schemas.microsoft.com/office/drawing/2015/9/8/chartex" xmlns:cx2="http://schemas.microsoft.com/office/drawing/2015/10/21/chartex" xmlns:cx3="http://schemas.microsoft.com/office/drawing/2016/5/9/chartex" xmlns:cx4="http://schemas.microsoft.com/office/drawing/2016/5/10/chartex" xmlns:cx5="http://schemas.microsoft.com/office/drawing/2016/5/11/chartex" xmlns:cx6="http://schemas.microsoft.com/office/drawing/2016/5/12/chartex" xmlns:cx7="http://schemas.microsoft.com/office/drawing/2016/5/13/chartex" xmlns:cx8="http://schemas.microsoft.com/office/drawing/2016/5/14/chartex" xmlns:mc="http://schemas.openxmlformats.org/markup-compatibility/2006" xmlns:aink="http://schemas.microsoft.com/office/drawing/2016/ink" xmlns:am3d="http://schemas.microsoft.com/office/drawing/2017/model3d" xmlns:o="urn:schemas-microsoft-com:office:office" xmlns:oel="http://schemas.microsoft.com/office/2019/extlst" xmlns:r="http://schemas.openxmlformats.org/officeDocument/2006/relationships" xmlns:m="http://schemas.openxmlformats.org/officeDocument/2006/math" xmlns:v="urn:schemas-microsoft-com:vml" xmlns:wp14="http://schemas.microsoft.com/office/word/2010/wordprocessingDrawing" xmlns:wp="http://schemas.openxmlformats.org/drawingml/2006/wordprocessingDrawing" xmlns:w10="urn:schemas-microsoft-com:office:word" xmlns:w="http://schemas.openxmlformats.org/wordprocessingml/2006/main" xmlns:w14="http://schemas.microsoft.com/office/word/2010/wordml" xmlns:w15="http://schemas.microsoft.com/office/word/2012/wordml" xmlns:w16cex="http://schemas.microsoft.com/office/word/2018/wordml/cex" xmlns:w16cid="http://schemas.microsoft.com/office/word/2016/wordml/cid" xmlns:w16="http://schemas.microsoft.com/office/word/2018/wordml" xmlns:w16sdtdh="http://schemas.microsoft.com/office/word/2020/wordml/sdtdatahash" xmlns:w16se="http://schemas.microsoft.com/office/word/2015/wordml/symex" xmlns:wpg="http://schemas.microsoft.com/office/word/2010/wordprocessingGroup" xmlns:wpi="http://schemas.microsoft.com/office/word/2010/wordprocessingInk" xmlns:wne="http://schemas.microsoft.com/office/word/2006/wordml" xmlns:wps="http://schemas.microsoft.com/office/word/2010/wordprocessingShape" mc:Ignorable="w14 w15 w16se w16cid w16 w16cex w16sdtdh wp14">
+<w:document xmlns:wpc="http://schemas.microsoft.com/office/word/2010/wordprocessingCanvas" xmlns:cx="http://schemas.microsoft.com/office/drawing/2014/chartex" xmlns:cx1="http://schemas.microsoft.com/office/drawing/2015/9/8/chartex" xmlns:cx2="http://schemas.microsoft.com/office/drawing/2015/10/21/chartex" xmlns:cx3="http://schemas.microsoft.com/office/drawing/2016/5/9/chartex" xmlns:cx4="http://schemas.microsoft.com/office/drawing/2016/5/10/chartex" xmlns:cx5="http://schemas.microsoft.com/office/drawing/2016/5/11/chartex" xmlns:cx6="http://schemas.microsoft.com/office/drawing/2016/5/12/chartex" xmlns:cx7="http://schemas.microsoft.com/office/drawing/2016/5/13/chartex" xmlns:cx8="http://schemas.microsoft.com/office/drawing/2016/5/14/chartex" xmlns:mc="http://schemas.openxmlformats.org/markup-compatibility/2006" xmlns:aink="http://schemas.microsoft.com/office/drawing/2016/ink" xmlns:am3d="http://schemas.microsoft.com/office/drawing/2017/model3d" xmlns:o="urn:schemas-microsoft-com:office:office" xmlns:oel="http://schemas.microsoft.com/office/2019/extlst" xmlns:r="http://schemas.openxmlformats.org/officeDocument/2006/relationships" xmlns:m="http://schemas.openxmlformats.org/officeDocument/2006/math" xmlns:v="urn:schemas-microsoft-com:vml" xmlns:wp14="http://schemas.microsoft.com/office/word/2010/wordprocessingDrawing" xmlns:wp="http://schemas.openxmlformats.org/drawingml/2006/wordprocessingDrawing" xmlns:w10="urn:schemas-microsoft-com:office:word" xmlns:w="http://schemas.openxmlformats.org/wordprocessingml/2006/main" xmlns:w14="http://schemas.microsoft.com/office/word/2010/wordml" xmlns:w15="http://schemas.microsoft.com/office/word/2012/wordml" xmlns:w16cex="http://schemas.microsoft.com/office/word/2018/wordml/cex" xmlns:w16cid="http://schemas.microsoft.com/office/word/2016/wordml/cid" xmlns:w16="http://schemas.microsoft.com/office/word/2018/wordml" xmlns:w16du="http://schemas.microsoft.com/office/word/2023/wordml/word16du" xmlns:w16sdtdh="http://schemas.microsoft.com/office/word/2020/wordml/sdtdatahash" xmlns:w16sdtfl="http://schemas.microsoft.com/office/word/2024/wordml/sdtformatlock" xmlns:w16se="http://schemas.microsoft.com/office/word/2015/wordml/symex" xmlns:wpg="http://schemas.microsoft.com/office/word/2010/wordprocessingGroup" xmlns:wpi="http://schemas.microsoft.com/office/word/2010/wordprocessingInk" xmlns:wne="http://schemas.microsoft.com/office/word/2006/wordml" xmlns:wps="http://schemas.microsoft.com/office/word/2010/wordprocessingShape" mc:Ignorable="w14 w15 w16se w16cid w16 w16cex w16sdtdh w16sdtfl w16du wp14">
   <w:body>
     <w:p>
       <w:pPr>
@@ -76,12 +76,14 @@
                 <w:rFonts w:ascii="Century Gothic" w:hAnsi="Century Gothic"/>
               </w:rPr>
             </w:pPr>
+            <w:proofErr w:type="gramStart"/>
             <w:r>
               <w:rPr>
                 <w:rFonts w:ascii="Century Gothic" w:hAnsi="Century Gothic"/>
               </w:rPr>
               <w:t>Nom:</w:t>
             </w:r>
+            <w:proofErr w:type="gramEnd"/>
             <w:r>
               <w:rPr>
                 <w:rFonts w:ascii="Century Gothic" w:hAnsi="Century Gothic"/>
@@ -156,7 +158,14 @@
               <w:rPr>
                 <w:rFonts w:ascii="Century Gothic" w:hAnsi="Century Gothic"/>
               </w:rPr>
-              <w:t xml:space="preserve">ETML   /  </w:t>
+              <w:t xml:space="preserve">ETML   </w:t>
+            </w:r>
+            <w:proofErr w:type="gramStart"/>
+            <w:r>
+              <w:rPr>
+                <w:rFonts w:ascii="Century Gothic" w:hAnsi="Century Gothic"/>
+              </w:rPr>
+              <w:t xml:space="preserve">/  </w:t>
             </w:r>
             <w:r>
               <w:rPr>
@@ -164,6 +173,7 @@
               </w:rPr>
               <w:t>VENNES</w:t>
             </w:r>
+            <w:proofErr w:type="gramEnd"/>
             <w:r>
               <w:rPr>
                 <w:rFonts w:ascii="Century Gothic" w:hAnsi="Century Gothic"/>
@@ -174,8 +184,16 @@
               <w:rPr>
                 <w:rFonts w:ascii="Century Gothic" w:hAnsi="Century Gothic"/>
               </w:rPr>
-              <w:t xml:space="preserve"> /  1010</w:t>
+              <w:t xml:space="preserve"> </w:t>
             </w:r>
+            <w:proofErr w:type="gramStart"/>
+            <w:r>
+              <w:rPr>
+                <w:rFonts w:ascii="Century Gothic" w:hAnsi="Century Gothic"/>
+              </w:rPr>
+              <w:t>/  1010</w:t>
+            </w:r>
+            <w:proofErr w:type="gramEnd"/>
             <w:r>
               <w:rPr>
                 <w:rFonts w:ascii="Century Gothic" w:hAnsi="Century Gothic"/>
@@ -227,12 +245,14 @@
                 <w:rFonts w:ascii="Century Gothic" w:hAnsi="Century Gothic"/>
               </w:rPr>
             </w:pPr>
+            <w:proofErr w:type="gramStart"/>
             <w:r>
               <w:rPr>
                 <w:rFonts w:ascii="Century Gothic" w:hAnsi="Century Gothic"/>
               </w:rPr>
               <w:t>Nom:</w:t>
             </w:r>
+            <w:proofErr w:type="gramEnd"/>
             <w:r>
               <w:rPr>
                 <w:rFonts w:ascii="Century Gothic" w:hAnsi="Century Gothic"/>
@@ -257,6 +277,7 @@
                 <w:b w:val="0"/>
               </w:rPr>
             </w:pPr>
+            <w:proofErr w:type="gramStart"/>
             <w:r>
               <w:rPr>
                 <w:rFonts w:ascii="Century Gothic" w:hAnsi="Century Gothic"/>
@@ -279,6 +300,7 @@
               </w:rPr>
               <w:t>:</w:t>
             </w:r>
+            <w:proofErr w:type="gramEnd"/>
             <w:r>
               <w:rPr>
                 <w:rFonts w:ascii="Century Gothic" w:hAnsi="Century Gothic"/>
@@ -1478,7 +1500,21 @@
         <w:rPr>
           <w:rFonts w:ascii="Century Gothic" w:hAnsi="Century Gothic"/>
         </w:rPr>
-        <w:t xml:space="preserve"> mais vous devez être en capacité d’expliquer chaque ligne de code que vous avez écrits (ou copi</w:t>
+        <w:t xml:space="preserve"> mais vous devez </w:t>
+      </w:r>
+      <w:proofErr w:type="gramStart"/>
+      <w:r>
+        <w:rPr>
+          <w:rFonts w:ascii="Century Gothic" w:hAnsi="Century Gothic"/>
+        </w:rPr>
+        <w:t>être en capacité</w:t>
+      </w:r>
+      <w:proofErr w:type="gramEnd"/>
+      <w:r>
+        <w:rPr>
+          <w:rFonts w:ascii="Century Gothic" w:hAnsi="Century Gothic"/>
+        </w:rPr>
+        <w:t xml:space="preserve"> d’expliquer chaque ligne de code que vous avez écrits (ou copi</w:t>
       </w:r>
       <w:r>
         <w:rPr>
@@ -1598,7 +1634,21 @@
         <w:rPr>
           <w:rFonts w:ascii="Century Gothic" w:hAnsi="Century Gothic"/>
         </w:rPr>
-        <w:t xml:space="preserve"> l'étudiant passe les cartes d’un deck en revue: il consulte le côté question, énonce une réponse</w:t>
+        <w:t xml:space="preserve"> l'étudiant passe les cartes d’un deck en </w:t>
+      </w:r>
+      <w:proofErr w:type="gramStart"/>
+      <w:r>
+        <w:rPr>
+          <w:rFonts w:ascii="Century Gothic" w:hAnsi="Century Gothic"/>
+        </w:rPr>
+        <w:t>revue:</w:t>
+      </w:r>
+      <w:proofErr w:type="gramEnd"/>
+      <w:r>
+        <w:rPr>
+          <w:rFonts w:ascii="Century Gothic" w:hAnsi="Century Gothic"/>
+        </w:rPr>
+        <w:t xml:space="preserve"> il consulte le côté question, énonce une réponse</w:t>
       </w:r>
       <w:r>
         <w:rPr>
@@ -1962,7 +2012,21 @@
         <w:rPr>
           <w:rFonts w:ascii="Century Gothic" w:hAnsi="Century Gothic"/>
         </w:rPr>
-        <w:t xml:space="preserve">Un joker est retiré suite à un comportement non professionnel (utilisation </w:t>
+        <w:t xml:space="preserve">Un joker est retiré </w:t>
+      </w:r>
+      <w:proofErr w:type="gramStart"/>
+      <w:r>
+        <w:rPr>
+          <w:rFonts w:ascii="Century Gothic" w:hAnsi="Century Gothic"/>
+        </w:rPr>
+        <w:t>suite à un</w:t>
+      </w:r>
+      <w:proofErr w:type="gramEnd"/>
+      <w:r>
+        <w:rPr>
+          <w:rFonts w:ascii="Century Gothic" w:hAnsi="Century Gothic"/>
+        </w:rPr>
+        <w:t xml:space="preserve"> comportement non professionnel (utilisation </w:t>
       </w:r>
       <w:r>
         <w:rPr>
@@ -3526,95 +3590,11 @@
         <w:t> » fait référence aux éléments de ce cahier des charges.</w:t>
       </w:r>
     </w:p>
-    <w:p>
-      <w:pPr>
-        <w:pStyle w:val="Corpsdetexte"/>
-        <w:rPr>
-          <w:rFonts w:ascii="Century Gothic" w:hAnsi="Century Gothic"/>
-          <w:lang w:val="fr-CH"/>
-        </w:rPr>
-      </w:pPr>
-    </w:p>
-    <w:p>
-      <w:pPr>
-        <w:pStyle w:val="Corpsdetexte"/>
-        <w:rPr>
-          <w:rFonts w:ascii="Century Gothic" w:hAnsi="Century Gothic"/>
-          <w:lang w:val="fr-CH"/>
-        </w:rPr>
-      </w:pPr>
-    </w:p>
-    <w:p>
-      <w:pPr>
-        <w:pStyle w:val="Corpsdetexte"/>
-        <w:rPr>
-          <w:rFonts w:ascii="Century Gothic" w:hAnsi="Century Gothic"/>
-          <w:lang w:val="fr-CH"/>
-        </w:rPr>
-      </w:pPr>
-      <w:r>
-        <w:rPr>
-          <w:rFonts w:ascii="Century Gothic" w:hAnsi="Century Gothic"/>
-          <w:lang w:val="fr-CH"/>
-        </w:rPr>
-        <w:t>Signature :</w:t>
-      </w:r>
-    </w:p>
-    <w:p>
-      <w:pPr>
-        <w:pStyle w:val="Corpsdetexte"/>
-        <w:rPr>
-          <w:rFonts w:ascii="Century Gothic" w:hAnsi="Century Gothic"/>
-          <w:lang w:val="fr-CH"/>
-        </w:rPr>
-      </w:pPr>
-      <w:r>
-        <w:rPr>
-          <w:rFonts w:ascii="Century Gothic" w:hAnsi="Century Gothic"/>
-          <w:lang w:val="fr-CH"/>
-        </w:rPr>
-        <w:drawing>
-          <wp:inline distT="0" distB="0" distL="0" distR="0" wp14:anchorId="7DAAC968" wp14:editId="3F68A490">
-            <wp:extent cx="3614420" cy="1444894"/>
-            <wp:effectExtent l="0" t="0" r="5080" b="3175"/>
-            <wp:docPr id="2009324015" name="Image 1"/>
-            <wp:cNvGraphicFramePr>
-              <a:graphicFrameLocks xmlns:a="http://schemas.openxmlformats.org/drawingml/2006/main" noChangeAspect="1"/>
-            </wp:cNvGraphicFramePr>
-            <a:graphic xmlns:a="http://schemas.openxmlformats.org/drawingml/2006/main">
-              <a:graphicData uri="http://schemas.openxmlformats.org/drawingml/2006/picture">
-                <pic:pic xmlns:pic="http://schemas.openxmlformats.org/drawingml/2006/picture">
-                  <pic:nvPicPr>
-                    <pic:cNvPr id="2009324015" name=""/>
-                    <pic:cNvPicPr/>
-                  </pic:nvPicPr>
-                  <pic:blipFill>
-                    <a:blip r:embed="rId16"/>
-                    <a:stretch>
-                      <a:fillRect/>
-                    </a:stretch>
-                  </pic:blipFill>
-                  <pic:spPr>
-                    <a:xfrm>
-                      <a:off x="0" y="0"/>
-                      <a:ext cx="3618070" cy="1446353"/>
-                    </a:xfrm>
-                    <a:prstGeom prst="rect">
-                      <a:avLst/>
-                    </a:prstGeom>
-                  </pic:spPr>
-                </pic:pic>
-              </a:graphicData>
-            </a:graphic>
-          </wp:inline>
-        </w:drawing>
-      </w:r>
-    </w:p>
     <w:sectPr>
-      <w:headerReference w:type="default" r:id="rId17"/>
-      <w:footerReference w:type="default" r:id="rId18"/>
-      <w:headerReference w:type="first" r:id="rId19"/>
-      <w:footerReference w:type="first" r:id="rId20"/>
+      <w:headerReference w:type="default" r:id="rId16"/>
+      <w:footerReference w:type="default" r:id="rId17"/>
+      <w:headerReference w:type="first" r:id="rId18"/>
+      <w:footerReference w:type="first" r:id="rId19"/>
       <w:pgSz w:w="11906" w:h="16838" w:code="9"/>
       <w:pgMar w:top="1560" w:right="851" w:bottom="782" w:left="1134" w:header="567" w:footer="482" w:gutter="0"/>
       <w:cols w:space="720"/>
@@ -3624,7 +3604,7 @@
 </file>
 
 <file path=word/endnotes.xml><?xml version="1.0" encoding="utf-8"?>
-<w:endnotes xmlns:wpc="http://schemas.microsoft.com/office/word/2010/wordprocessingCanvas" xmlns:cx="http://schemas.microsoft.com/office/drawing/2014/chartex" xmlns:cx1="http://schemas.microsoft.com/office/drawing/2015/9/8/chartex" xmlns:cx2="http://schemas.microsoft.com/office/drawing/2015/10/21/chartex" xmlns:cx3="http://schemas.microsoft.com/office/drawing/2016/5/9/chartex" xmlns:cx4="http://schemas.microsoft.com/office/drawing/2016/5/10/chartex" xmlns:cx5="http://schemas.microsoft.com/office/drawing/2016/5/11/chartex" xmlns:cx6="http://schemas.microsoft.com/office/drawing/2016/5/12/chartex" xmlns:cx7="http://schemas.microsoft.com/office/drawing/2016/5/13/chartex" xmlns:cx8="http://schemas.microsoft.com/office/drawing/2016/5/14/chartex" xmlns:mc="http://schemas.openxmlformats.org/markup-compatibility/2006" xmlns:aink="http://schemas.microsoft.com/office/drawing/2016/ink" xmlns:am3d="http://schemas.microsoft.com/office/drawing/2017/model3d" xmlns:o="urn:schemas-microsoft-com:office:office" xmlns:oel="http://schemas.microsoft.com/office/2019/extlst" xmlns:r="http://schemas.openxmlformats.org/officeDocument/2006/relationships" xmlns:m="http://schemas.openxmlformats.org/officeDocument/2006/math" xmlns:v="urn:schemas-microsoft-com:vml" xmlns:wp14="http://schemas.microsoft.com/office/word/2010/wordprocessingDrawing" xmlns:wp="http://schemas.openxmlformats.org/drawingml/2006/wordprocessingDrawing" xmlns:w10="urn:schemas-microsoft-com:office:word" xmlns:w="http://schemas.openxmlformats.org/wordprocessingml/2006/main" xmlns:w14="http://schemas.microsoft.com/office/word/2010/wordml" xmlns:w15="http://schemas.microsoft.com/office/word/2012/wordml" xmlns:w16cex="http://schemas.microsoft.com/office/word/2018/wordml/cex" xmlns:w16cid="http://schemas.microsoft.com/office/word/2016/wordml/cid" xmlns:w16="http://schemas.microsoft.com/office/word/2018/wordml" xmlns:w16sdtdh="http://schemas.microsoft.com/office/word/2020/wordml/sdtdatahash" xmlns:w16se="http://schemas.microsoft.com/office/word/2015/wordml/symex" xmlns:wpg="http://schemas.microsoft.com/office/word/2010/wordprocessingGroup" xmlns:wpi="http://schemas.microsoft.com/office/word/2010/wordprocessingInk" xmlns:wne="http://schemas.microsoft.com/office/word/2006/wordml" xmlns:wps="http://schemas.microsoft.com/office/word/2010/wordprocessingShape" mc:Ignorable="w14 w15 w16se w16cid w16 w16cex w16sdtdh wp14">
+<w:endnotes xmlns:wpc="http://schemas.microsoft.com/office/word/2010/wordprocessingCanvas" xmlns:cx="http://schemas.microsoft.com/office/drawing/2014/chartex" xmlns:cx1="http://schemas.microsoft.com/office/drawing/2015/9/8/chartex" xmlns:cx2="http://schemas.microsoft.com/office/drawing/2015/10/21/chartex" xmlns:cx3="http://schemas.microsoft.com/office/drawing/2016/5/9/chartex" xmlns:cx4="http://schemas.microsoft.com/office/drawing/2016/5/10/chartex" xmlns:cx5="http://schemas.microsoft.com/office/drawing/2016/5/11/chartex" xmlns:cx6="http://schemas.microsoft.com/office/drawing/2016/5/12/chartex" xmlns:cx7="http://schemas.microsoft.com/office/drawing/2016/5/13/chartex" xmlns:cx8="http://schemas.microsoft.com/office/drawing/2016/5/14/chartex" xmlns:mc="http://schemas.openxmlformats.org/markup-compatibility/2006" xmlns:aink="http://schemas.microsoft.com/office/drawing/2016/ink" xmlns:am3d="http://schemas.microsoft.com/office/drawing/2017/model3d" xmlns:o="urn:schemas-microsoft-com:office:office" xmlns:oel="http://schemas.microsoft.com/office/2019/extlst" xmlns:r="http://schemas.openxmlformats.org/officeDocument/2006/relationships" xmlns:m="http://schemas.openxmlformats.org/officeDocument/2006/math" xmlns:v="urn:schemas-microsoft-com:vml" xmlns:wp14="http://schemas.microsoft.com/office/word/2010/wordprocessingDrawing" xmlns:wp="http://schemas.openxmlformats.org/drawingml/2006/wordprocessingDrawing" xmlns:w10="urn:schemas-microsoft-com:office:word" xmlns:w="http://schemas.openxmlformats.org/wordprocessingml/2006/main" xmlns:w14="http://schemas.microsoft.com/office/word/2010/wordml" xmlns:w15="http://schemas.microsoft.com/office/word/2012/wordml" xmlns:w16cex="http://schemas.microsoft.com/office/word/2018/wordml/cex" xmlns:w16cid="http://schemas.microsoft.com/office/word/2016/wordml/cid" xmlns:w16="http://schemas.microsoft.com/office/word/2018/wordml" xmlns:w16du="http://schemas.microsoft.com/office/word/2023/wordml/word16du" xmlns:w16sdtdh="http://schemas.microsoft.com/office/word/2020/wordml/sdtdatahash" xmlns:w16sdtfl="http://schemas.microsoft.com/office/word/2024/wordml/sdtformatlock" xmlns:w16se="http://schemas.microsoft.com/office/word/2015/wordml/symex" xmlns:wpg="http://schemas.microsoft.com/office/word/2010/wordprocessingGroup" xmlns:wpi="http://schemas.microsoft.com/office/word/2010/wordprocessingInk" xmlns:wne="http://schemas.microsoft.com/office/word/2006/wordml" xmlns:wps="http://schemas.microsoft.com/office/word/2010/wordprocessingShape" mc:Ignorable="w14 w15 w16se w16cid w16 w16cex w16sdtdh w16sdtfl w16du wp14">
   <w:endnote w:type="separator" w:id="-1">
     <w:p>
       <w:r>
@@ -3646,7 +3626,7 @@
 </file>
 
 <file path=word/footer1.xml><?xml version="1.0" encoding="utf-8"?>
-<w:ftr xmlns:wpc="http://schemas.microsoft.com/office/word/2010/wordprocessingCanvas" xmlns:cx="http://schemas.microsoft.com/office/drawing/2014/chartex" xmlns:cx1="http://schemas.microsoft.com/office/drawing/2015/9/8/chartex" xmlns:cx2="http://schemas.microsoft.com/office/drawing/2015/10/21/chartex" xmlns:cx3="http://schemas.microsoft.com/office/drawing/2016/5/9/chartex" xmlns:cx4="http://schemas.microsoft.com/office/drawing/2016/5/10/chartex" xmlns:cx5="http://schemas.microsoft.com/office/drawing/2016/5/11/chartex" xmlns:cx6="http://schemas.microsoft.com/office/drawing/2016/5/12/chartex" xmlns:cx7="http://schemas.microsoft.com/office/drawing/2016/5/13/chartex" xmlns:cx8="http://schemas.microsoft.com/office/drawing/2016/5/14/chartex" xmlns:mc="http://schemas.openxmlformats.org/markup-compatibility/2006" xmlns:aink="http://schemas.microsoft.com/office/drawing/2016/ink" xmlns:am3d="http://schemas.microsoft.com/office/drawing/2017/model3d" xmlns:o="urn:schemas-microsoft-com:office:office" xmlns:oel="http://schemas.microsoft.com/office/2019/extlst" xmlns:r="http://schemas.openxmlformats.org/officeDocument/2006/relationships" xmlns:m="http://schemas.openxmlformats.org/officeDocument/2006/math" xmlns:v="urn:schemas-microsoft-com:vml" xmlns:wp14="http://schemas.microsoft.com/office/word/2010/wordprocessingDrawing" xmlns:wp="http://schemas.openxmlformats.org/drawingml/2006/wordprocessingDrawing" xmlns:w10="urn:schemas-microsoft-com:office:word" xmlns:w="http://schemas.openxmlformats.org/wordprocessingml/2006/main" xmlns:w14="http://schemas.microsoft.com/office/word/2010/wordml" xmlns:w15="http://schemas.microsoft.com/office/word/2012/wordml" xmlns:w16cex="http://schemas.microsoft.com/office/word/2018/wordml/cex" xmlns:w16cid="http://schemas.microsoft.com/office/word/2016/wordml/cid" xmlns:w16="http://schemas.microsoft.com/office/word/2018/wordml" xmlns:w16sdtdh="http://schemas.microsoft.com/office/word/2020/wordml/sdtdatahash" xmlns:w16se="http://schemas.microsoft.com/office/word/2015/wordml/symex" xmlns:wpg="http://schemas.microsoft.com/office/word/2010/wordprocessingGroup" xmlns:wpi="http://schemas.microsoft.com/office/word/2010/wordprocessingInk" xmlns:wne="http://schemas.microsoft.com/office/word/2006/wordml" xmlns:wps="http://schemas.microsoft.com/office/word/2010/wordprocessingShape" mc:Ignorable="w14 w15 w16se w16cid w16 w16cex w16sdtdh wp14">
+<w:ftr xmlns:wpc="http://schemas.microsoft.com/office/word/2010/wordprocessingCanvas" xmlns:cx="http://schemas.microsoft.com/office/drawing/2014/chartex" xmlns:cx1="http://schemas.microsoft.com/office/drawing/2015/9/8/chartex" xmlns:cx2="http://schemas.microsoft.com/office/drawing/2015/10/21/chartex" xmlns:cx3="http://schemas.microsoft.com/office/drawing/2016/5/9/chartex" xmlns:cx4="http://schemas.microsoft.com/office/drawing/2016/5/10/chartex" xmlns:cx5="http://schemas.microsoft.com/office/drawing/2016/5/11/chartex" xmlns:cx6="http://schemas.microsoft.com/office/drawing/2016/5/12/chartex" xmlns:cx7="http://schemas.microsoft.com/office/drawing/2016/5/13/chartex" xmlns:cx8="http://schemas.microsoft.com/office/drawing/2016/5/14/chartex" xmlns:mc="http://schemas.openxmlformats.org/markup-compatibility/2006" xmlns:aink="http://schemas.microsoft.com/office/drawing/2016/ink" xmlns:am3d="http://schemas.microsoft.com/office/drawing/2017/model3d" xmlns:o="urn:schemas-microsoft-com:office:office" xmlns:oel="http://schemas.microsoft.com/office/2019/extlst" xmlns:r="http://schemas.openxmlformats.org/officeDocument/2006/relationships" xmlns:m="http://schemas.openxmlformats.org/officeDocument/2006/math" xmlns:v="urn:schemas-microsoft-com:vml" xmlns:wp14="http://schemas.microsoft.com/office/word/2010/wordprocessingDrawing" xmlns:wp="http://schemas.openxmlformats.org/drawingml/2006/wordprocessingDrawing" xmlns:w10="urn:schemas-microsoft-com:office:word" xmlns:w="http://schemas.openxmlformats.org/wordprocessingml/2006/main" xmlns:w14="http://schemas.microsoft.com/office/word/2010/wordml" xmlns:w15="http://schemas.microsoft.com/office/word/2012/wordml" xmlns:w16cex="http://schemas.microsoft.com/office/word/2018/wordml/cex" xmlns:w16cid="http://schemas.microsoft.com/office/word/2016/wordml/cid" xmlns:w16="http://schemas.microsoft.com/office/word/2018/wordml" xmlns:w16du="http://schemas.microsoft.com/office/word/2023/wordml/word16du" xmlns:w16sdtdh="http://schemas.microsoft.com/office/word/2020/wordml/sdtdatahash" xmlns:w16sdtfl="http://schemas.microsoft.com/office/word/2024/wordml/sdtformatlock" xmlns:w16se="http://schemas.microsoft.com/office/word/2015/wordml/symex" xmlns:wpg="http://schemas.microsoft.com/office/word/2010/wordprocessingGroup" xmlns:wpi="http://schemas.microsoft.com/office/word/2010/wordprocessingInk" xmlns:wne="http://schemas.microsoft.com/office/word/2006/wordml" xmlns:wps="http://schemas.microsoft.com/office/word/2010/wordprocessingShape" mc:Ignorable="w14 w15 w16se w16cid w16 w16cex w16sdtdh w16sdtfl w16du wp14">
   <w:tbl>
     <w:tblPr>
       <w:tblW w:w="9923" w:type="dxa"/>
@@ -3882,7 +3862,7 @@
               <w:sz w:val="16"/>
               <w:szCs w:val="16"/>
             </w:rPr>
-            <w:t>14.01.2026</w:t>
+            <w:t>07.01.2026</w:t>
           </w:r>
           <w:r>
             <w:rPr>
@@ -4301,7 +4281,7 @@
 </file>
 
 <file path=word/footer2.xml><?xml version="1.0" encoding="utf-8"?>
-<w:ftr xmlns:wpc="http://schemas.microsoft.com/office/word/2010/wordprocessingCanvas" xmlns:cx="http://schemas.microsoft.com/office/drawing/2014/chartex" xmlns:cx1="http://schemas.microsoft.com/office/drawing/2015/9/8/chartex" xmlns:cx2="http://schemas.microsoft.com/office/drawing/2015/10/21/chartex" xmlns:cx3="http://schemas.microsoft.com/office/drawing/2016/5/9/chartex" xmlns:cx4="http://schemas.microsoft.com/office/drawing/2016/5/10/chartex" xmlns:cx5="http://schemas.microsoft.com/office/drawing/2016/5/11/chartex" xmlns:cx6="http://schemas.microsoft.com/office/drawing/2016/5/12/chartex" xmlns:cx7="http://schemas.microsoft.com/office/drawing/2016/5/13/chartex" xmlns:cx8="http://schemas.microsoft.com/office/drawing/2016/5/14/chartex" xmlns:mc="http://schemas.openxmlformats.org/markup-compatibility/2006" xmlns:aink="http://schemas.microsoft.com/office/drawing/2016/ink" xmlns:am3d="http://schemas.microsoft.com/office/drawing/2017/model3d" xmlns:o="urn:schemas-microsoft-com:office:office" xmlns:oel="http://schemas.microsoft.com/office/2019/extlst" xmlns:r="http://schemas.openxmlformats.org/officeDocument/2006/relationships" xmlns:m="http://schemas.openxmlformats.org/officeDocument/2006/math" xmlns:v="urn:schemas-microsoft-com:vml" xmlns:wp14="http://schemas.microsoft.com/office/word/2010/wordprocessingDrawing" xmlns:wp="http://schemas.openxmlformats.org/drawingml/2006/wordprocessingDrawing" xmlns:w10="urn:schemas-microsoft-com:office:word" xmlns:w="http://schemas.openxmlformats.org/wordprocessingml/2006/main" xmlns:w14="http://schemas.microsoft.com/office/word/2010/wordml" xmlns:w15="http://schemas.microsoft.com/office/word/2012/wordml" xmlns:w16cex="http://schemas.microsoft.com/office/word/2018/wordml/cex" xmlns:w16cid="http://schemas.microsoft.com/office/word/2016/wordml/cid" xmlns:w16="http://schemas.microsoft.com/office/word/2018/wordml" xmlns:w16sdtdh="http://schemas.microsoft.com/office/word/2020/wordml/sdtdatahash" xmlns:w16se="http://schemas.microsoft.com/office/word/2015/wordml/symex" xmlns:wpg="http://schemas.microsoft.com/office/word/2010/wordprocessingGroup" xmlns:wpi="http://schemas.microsoft.com/office/word/2010/wordprocessingInk" xmlns:wne="http://schemas.microsoft.com/office/word/2006/wordml" xmlns:wps="http://schemas.microsoft.com/office/word/2010/wordprocessingShape" mc:Ignorable="w14 w15 w16se w16cid w16 w16cex w16sdtdh wp14">
+<w:ftr xmlns:wpc="http://schemas.microsoft.com/office/word/2010/wordprocessingCanvas" xmlns:cx="http://schemas.microsoft.com/office/drawing/2014/chartex" xmlns:cx1="http://schemas.microsoft.com/office/drawing/2015/9/8/chartex" xmlns:cx2="http://schemas.microsoft.com/office/drawing/2015/10/21/chartex" xmlns:cx3="http://schemas.microsoft.com/office/drawing/2016/5/9/chartex" xmlns:cx4="http://schemas.microsoft.com/office/drawing/2016/5/10/chartex" xmlns:cx5="http://schemas.microsoft.com/office/drawing/2016/5/11/chartex" xmlns:cx6="http://schemas.microsoft.com/office/drawing/2016/5/12/chartex" xmlns:cx7="http://schemas.microsoft.com/office/drawing/2016/5/13/chartex" xmlns:cx8="http://schemas.microsoft.com/office/drawing/2016/5/14/chartex" xmlns:mc="http://schemas.openxmlformats.org/markup-compatibility/2006" xmlns:aink="http://schemas.microsoft.com/office/drawing/2016/ink" xmlns:am3d="http://schemas.microsoft.com/office/drawing/2017/model3d" xmlns:o="urn:schemas-microsoft-com:office:office" xmlns:oel="http://schemas.microsoft.com/office/2019/extlst" xmlns:r="http://schemas.openxmlformats.org/officeDocument/2006/relationships" xmlns:m="http://schemas.openxmlformats.org/officeDocument/2006/math" xmlns:v="urn:schemas-microsoft-com:vml" xmlns:wp14="http://schemas.microsoft.com/office/word/2010/wordprocessingDrawing" xmlns:wp="http://schemas.openxmlformats.org/drawingml/2006/wordprocessingDrawing" xmlns:w10="urn:schemas-microsoft-com:office:word" xmlns:w="http://schemas.openxmlformats.org/wordprocessingml/2006/main" xmlns:w14="http://schemas.microsoft.com/office/word/2010/wordml" xmlns:w15="http://schemas.microsoft.com/office/word/2012/wordml" xmlns:w16cex="http://schemas.microsoft.com/office/word/2018/wordml/cex" xmlns:w16cid="http://schemas.microsoft.com/office/word/2016/wordml/cid" xmlns:w16="http://schemas.microsoft.com/office/word/2018/wordml" xmlns:w16du="http://schemas.microsoft.com/office/word/2023/wordml/word16du" xmlns:w16sdtdh="http://schemas.microsoft.com/office/word/2020/wordml/sdtdatahash" xmlns:w16sdtfl="http://schemas.microsoft.com/office/word/2024/wordml/sdtformatlock" xmlns:w16se="http://schemas.microsoft.com/office/word/2015/wordml/symex" xmlns:wpg="http://schemas.microsoft.com/office/word/2010/wordprocessingGroup" xmlns:wpi="http://schemas.microsoft.com/office/word/2010/wordprocessingInk" xmlns:wne="http://schemas.microsoft.com/office/word/2006/wordml" xmlns:wps="http://schemas.microsoft.com/office/word/2010/wordprocessingShape" mc:Ignorable="w14 w15 w16se w16cid w16 w16cex w16sdtdh w16sdtfl w16du wp14">
   <w:p>
     <w:pPr>
       <w:pStyle w:val="Pieddepage"/>
@@ -4380,7 +4360,7 @@
             </wp:anchor>
           </w:drawing>
         </mc:Choice>
-        <mc:Fallback xmlns:w16sdtfl="http://schemas.microsoft.com/office/word/2024/wordml/sdtformatlock" xmlns:w16du="http://schemas.microsoft.com/office/word/2023/wordml/word16du">
+        <mc:Fallback>
           <w:pict>
             <v:line w14:anchorId="77669257" id="Line 2" o:spid="_x0000_s1026" style="position:absolute;z-index:251657728;visibility:visible;mso-wrap-style:square;mso-width-percent:0;mso-height-percent:0;mso-wrap-distance-left:9pt;mso-wrap-distance-top:0;mso-wrap-distance-right:9pt;mso-wrap-distance-bottom:0;mso-position-horizontal:absolute;mso-position-horizontal-relative:text;mso-position-vertical:absolute;mso-position-vertical-relative:text;mso-width-percent:0;mso-height-percent:0;mso-width-relative:page;mso-height-relative:page" from="-.5pt,-.1pt" to="496.35pt,-.1pt" o:gfxdata="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"/>
           </w:pict>
@@ -4551,7 +4531,7 @@
         <w:snapToGrid w:val="0"/>
         <w:sz w:val="12"/>
       </w:rPr>
-      <w:t>14/01/2026</w:t>
+      <w:t>07/01/2026</w:t>
     </w:r>
     <w:r>
       <w:rPr>
@@ -4600,7 +4580,7 @@
         <w:snapToGrid w:val="0"/>
         <w:sz w:val="12"/>
       </w:rPr>
-      <w:t>13:01</w:t>
+      <w:t>11:19</w:t>
     </w:r>
     <w:r>
       <w:rPr>
@@ -4742,7 +4722,7 @@
 </file>
 
 <file path=word/footnotes.xml><?xml version="1.0" encoding="utf-8"?>
-<w:footnotes xmlns:wpc="http://schemas.microsoft.com/office/word/2010/wordprocessingCanvas" xmlns:cx="http://schemas.microsoft.com/office/drawing/2014/chartex" xmlns:cx1="http://schemas.microsoft.com/office/drawing/2015/9/8/chartex" xmlns:cx2="http://schemas.microsoft.com/office/drawing/2015/10/21/chartex" xmlns:cx3="http://schemas.microsoft.com/office/drawing/2016/5/9/chartex" xmlns:cx4="http://schemas.microsoft.com/office/drawing/2016/5/10/chartex" xmlns:cx5="http://schemas.microsoft.com/office/drawing/2016/5/11/chartex" xmlns:cx6="http://schemas.microsoft.com/office/drawing/2016/5/12/chartex" xmlns:cx7="http://schemas.microsoft.com/office/drawing/2016/5/13/chartex" xmlns:cx8="http://schemas.microsoft.com/office/drawing/2016/5/14/chartex" xmlns:mc="http://schemas.openxmlformats.org/markup-compatibility/2006" xmlns:aink="http://schemas.microsoft.com/office/drawing/2016/ink" xmlns:am3d="http://schemas.microsoft.com/office/drawing/2017/model3d" xmlns:o="urn:schemas-microsoft-com:office:office" xmlns:oel="http://schemas.microsoft.com/office/2019/extlst" xmlns:r="http://schemas.openxmlformats.org/officeDocument/2006/relationships" xmlns:m="http://schemas.openxmlformats.org/officeDocument/2006/math" xmlns:v="urn:schemas-microsoft-com:vml" xmlns:wp14="http://schemas.microsoft.com/office/word/2010/wordprocessingDrawing" xmlns:wp="http://schemas.openxmlformats.org/drawingml/2006/wordprocessingDrawing" xmlns:w10="urn:schemas-microsoft-com:office:word" xmlns:w="http://schemas.openxmlformats.org/wordprocessingml/2006/main" xmlns:w14="http://schemas.microsoft.com/office/word/2010/wordml" xmlns:w15="http://schemas.microsoft.com/office/word/2012/wordml" xmlns:w16cex="http://schemas.microsoft.com/office/word/2018/wordml/cex" xmlns:w16cid="http://schemas.microsoft.com/office/word/2016/wordml/cid" xmlns:w16="http://schemas.microsoft.com/office/word/2018/wordml" xmlns:w16sdtdh="http://schemas.microsoft.com/office/word/2020/wordml/sdtdatahash" xmlns:w16se="http://schemas.microsoft.com/office/word/2015/wordml/symex" xmlns:wpg="http://schemas.microsoft.com/office/word/2010/wordprocessingGroup" xmlns:wpi="http://schemas.microsoft.com/office/word/2010/wordprocessingInk" xmlns:wne="http://schemas.microsoft.com/office/word/2006/wordml" xmlns:wps="http://schemas.microsoft.com/office/word/2010/wordprocessingShape" mc:Ignorable="w14 w15 w16se w16cid w16 w16cex w16sdtdh wp14">
+<w:footnotes xmlns:wpc="http://schemas.microsoft.com/office/word/2010/wordprocessingCanvas" xmlns:cx="http://schemas.microsoft.com/office/drawing/2014/chartex" xmlns:cx1="http://schemas.microsoft.com/office/drawing/2015/9/8/chartex" xmlns:cx2="http://schemas.microsoft.com/office/drawing/2015/10/21/chartex" xmlns:cx3="http://schemas.microsoft.com/office/drawing/2016/5/9/chartex" xmlns:cx4="http://schemas.microsoft.com/office/drawing/2016/5/10/chartex" xmlns:cx5="http://schemas.microsoft.com/office/drawing/2016/5/11/chartex" xmlns:cx6="http://schemas.microsoft.com/office/drawing/2016/5/12/chartex" xmlns:cx7="http://schemas.microsoft.com/office/drawing/2016/5/13/chartex" xmlns:cx8="http://schemas.microsoft.com/office/drawing/2016/5/14/chartex" xmlns:mc="http://schemas.openxmlformats.org/markup-compatibility/2006" xmlns:aink="http://schemas.microsoft.com/office/drawing/2016/ink" xmlns:am3d="http://schemas.microsoft.com/office/drawing/2017/model3d" xmlns:o="urn:schemas-microsoft-com:office:office" xmlns:oel="http://schemas.microsoft.com/office/2019/extlst" xmlns:r="http://schemas.openxmlformats.org/officeDocument/2006/relationships" xmlns:m="http://schemas.openxmlformats.org/officeDocument/2006/math" xmlns:v="urn:schemas-microsoft-com:vml" xmlns:wp14="http://schemas.microsoft.com/office/word/2010/wordprocessingDrawing" xmlns:wp="http://schemas.openxmlformats.org/drawingml/2006/wordprocessingDrawing" xmlns:w10="urn:schemas-microsoft-com:office:word" xmlns:w="http://schemas.openxmlformats.org/wordprocessingml/2006/main" xmlns:w14="http://schemas.microsoft.com/office/word/2010/wordml" xmlns:w15="http://schemas.microsoft.com/office/word/2012/wordml" xmlns:w16cex="http://schemas.microsoft.com/office/word/2018/wordml/cex" xmlns:w16cid="http://schemas.microsoft.com/office/word/2016/wordml/cid" xmlns:w16="http://schemas.microsoft.com/office/word/2018/wordml" xmlns:w16du="http://schemas.microsoft.com/office/word/2023/wordml/word16du" xmlns:w16sdtdh="http://schemas.microsoft.com/office/word/2020/wordml/sdtdatahash" xmlns:w16sdtfl="http://schemas.microsoft.com/office/word/2024/wordml/sdtformatlock" xmlns:w16se="http://schemas.microsoft.com/office/word/2015/wordml/symex" xmlns:wpg="http://schemas.microsoft.com/office/word/2010/wordprocessingGroup" xmlns:wpi="http://schemas.microsoft.com/office/word/2010/wordprocessingInk" xmlns:wne="http://schemas.microsoft.com/office/word/2006/wordml" xmlns:wps="http://schemas.microsoft.com/office/word/2010/wordprocessingShape" mc:Ignorable="w14 w15 w16se w16cid w16 w16cex w16sdtdh w16sdtfl w16du wp14">
   <w:footnote w:type="separator" w:id="-1">
     <w:p>
       <w:r>
@@ -4764,7 +4744,7 @@
 </file>
 
 <file path=word/header1.xml><?xml version="1.0" encoding="utf-8"?>
-<w:hdr xmlns:wpc="http://schemas.microsoft.com/office/word/2010/wordprocessingCanvas" xmlns:cx="http://schemas.microsoft.com/office/drawing/2014/chartex" xmlns:cx1="http://schemas.microsoft.com/office/drawing/2015/9/8/chartex" xmlns:cx2="http://schemas.microsoft.com/office/drawing/2015/10/21/chartex" xmlns:cx3="http://schemas.microsoft.com/office/drawing/2016/5/9/chartex" xmlns:cx4="http://schemas.microsoft.com/office/drawing/2016/5/10/chartex" xmlns:cx5="http://schemas.microsoft.com/office/drawing/2016/5/11/chartex" xmlns:cx6="http://schemas.microsoft.com/office/drawing/2016/5/12/chartex" xmlns:cx7="http://schemas.microsoft.com/office/drawing/2016/5/13/chartex" xmlns:cx8="http://schemas.microsoft.com/office/drawing/2016/5/14/chartex" xmlns:mc="http://schemas.openxmlformats.org/markup-compatibility/2006" xmlns:aink="http://schemas.microsoft.com/office/drawing/2016/ink" xmlns:am3d="http://schemas.microsoft.com/office/drawing/2017/model3d" xmlns:o="urn:schemas-microsoft-com:office:office" xmlns:oel="http://schemas.microsoft.com/office/2019/extlst" xmlns:r="http://schemas.openxmlformats.org/officeDocument/2006/relationships" xmlns:m="http://schemas.openxmlformats.org/officeDocument/2006/math" xmlns:v="urn:schemas-microsoft-com:vml" xmlns:wp14="http://schemas.microsoft.com/office/word/2010/wordprocessingDrawing" xmlns:wp="http://schemas.openxmlformats.org/drawingml/2006/wordprocessingDrawing" xmlns:w10="urn:schemas-microsoft-com:office:word" xmlns:w="http://schemas.openxmlformats.org/wordprocessingml/2006/main" xmlns:w14="http://schemas.microsoft.com/office/word/2010/wordml" xmlns:w15="http://schemas.microsoft.com/office/word/2012/wordml" xmlns:w16cex="http://schemas.microsoft.com/office/word/2018/wordml/cex" xmlns:w16cid="http://schemas.microsoft.com/office/word/2016/wordml/cid" xmlns:w16="http://schemas.microsoft.com/office/word/2018/wordml" xmlns:w16sdtdh="http://schemas.microsoft.com/office/word/2020/wordml/sdtdatahash" xmlns:w16se="http://schemas.microsoft.com/office/word/2015/wordml/symex" xmlns:wpg="http://schemas.microsoft.com/office/word/2010/wordprocessingGroup" xmlns:wpi="http://schemas.microsoft.com/office/word/2010/wordprocessingInk" xmlns:wne="http://schemas.microsoft.com/office/word/2006/wordml" xmlns:wps="http://schemas.microsoft.com/office/word/2010/wordprocessingShape" mc:Ignorable="w14 w15 w16se w16cid w16 w16cex w16sdtdh wp14">
+<w:hdr xmlns:wpc="http://schemas.microsoft.com/office/word/2010/wordprocessingCanvas" xmlns:cx="http://schemas.microsoft.com/office/drawing/2014/chartex" xmlns:cx1="http://schemas.microsoft.com/office/drawing/2015/9/8/chartex" xmlns:cx2="http://schemas.microsoft.com/office/drawing/2015/10/21/chartex" xmlns:cx3="http://schemas.microsoft.com/office/drawing/2016/5/9/chartex" xmlns:cx4="http://schemas.microsoft.com/office/drawing/2016/5/10/chartex" xmlns:cx5="http://schemas.microsoft.com/office/drawing/2016/5/11/chartex" xmlns:cx6="http://schemas.microsoft.com/office/drawing/2016/5/12/chartex" xmlns:cx7="http://schemas.microsoft.com/office/drawing/2016/5/13/chartex" xmlns:cx8="http://schemas.microsoft.com/office/drawing/2016/5/14/chartex" xmlns:mc="http://schemas.openxmlformats.org/markup-compatibility/2006" xmlns:aink="http://schemas.microsoft.com/office/drawing/2016/ink" xmlns:am3d="http://schemas.microsoft.com/office/drawing/2017/model3d" xmlns:o="urn:schemas-microsoft-com:office:office" xmlns:oel="http://schemas.microsoft.com/office/2019/extlst" xmlns:r="http://schemas.openxmlformats.org/officeDocument/2006/relationships" xmlns:m="http://schemas.openxmlformats.org/officeDocument/2006/math" xmlns:v="urn:schemas-microsoft-com:vml" xmlns:wp14="http://schemas.microsoft.com/office/word/2010/wordprocessingDrawing" xmlns:wp="http://schemas.openxmlformats.org/drawingml/2006/wordprocessingDrawing" xmlns:w10="urn:schemas-microsoft-com:office:word" xmlns:w="http://schemas.openxmlformats.org/wordprocessingml/2006/main" xmlns:w14="http://schemas.microsoft.com/office/word/2010/wordml" xmlns:w15="http://schemas.microsoft.com/office/word/2012/wordml" xmlns:w16cex="http://schemas.microsoft.com/office/word/2018/wordml/cex" xmlns:w16cid="http://schemas.microsoft.com/office/word/2016/wordml/cid" xmlns:w16="http://schemas.microsoft.com/office/word/2018/wordml" xmlns:w16du="http://schemas.microsoft.com/office/word/2023/wordml/word16du" xmlns:w16sdtdh="http://schemas.microsoft.com/office/word/2020/wordml/sdtdatahash" xmlns:w16sdtfl="http://schemas.microsoft.com/office/word/2024/wordml/sdtformatlock" xmlns:w16se="http://schemas.microsoft.com/office/word/2015/wordml/symex" xmlns:wpg="http://schemas.microsoft.com/office/word/2010/wordprocessingGroup" xmlns:wpi="http://schemas.microsoft.com/office/word/2010/wordprocessingInk" xmlns:wne="http://schemas.microsoft.com/office/word/2006/wordml" xmlns:wps="http://schemas.microsoft.com/office/word/2010/wordprocessingShape" mc:Ignorable="w14 w15 w16se w16cid w16 w16cex w16sdtdh w16sdtfl w16du wp14">
   <w:tbl>
     <w:tblPr>
       <w:tblW w:w="10084" w:type="dxa"/>
@@ -4944,7 +4924,7 @@
 </file>
 
 <file path=word/header2.xml><?xml version="1.0" encoding="utf-8"?>
-<w:hdr xmlns:wpc="http://schemas.microsoft.com/office/word/2010/wordprocessingCanvas" xmlns:cx="http://schemas.microsoft.com/office/drawing/2014/chartex" xmlns:cx1="http://schemas.microsoft.com/office/drawing/2015/9/8/chartex" xmlns:cx2="http://schemas.microsoft.com/office/drawing/2015/10/21/chartex" xmlns:cx3="http://schemas.microsoft.com/office/drawing/2016/5/9/chartex" xmlns:cx4="http://schemas.microsoft.com/office/drawing/2016/5/10/chartex" xmlns:cx5="http://schemas.microsoft.com/office/drawing/2016/5/11/chartex" xmlns:cx6="http://schemas.microsoft.com/office/drawing/2016/5/12/chartex" xmlns:cx7="http://schemas.microsoft.com/office/drawing/2016/5/13/chartex" xmlns:cx8="http://schemas.microsoft.com/office/drawing/2016/5/14/chartex" xmlns:mc="http://schemas.openxmlformats.org/markup-compatibility/2006" xmlns:aink="http://schemas.microsoft.com/office/drawing/2016/ink" xmlns:am3d="http://schemas.microsoft.com/office/drawing/2017/model3d" xmlns:o="urn:schemas-microsoft-com:office:office" xmlns:oel="http://schemas.microsoft.com/office/2019/extlst" xmlns:r="http://schemas.openxmlformats.org/officeDocument/2006/relationships" xmlns:m="http://schemas.openxmlformats.org/officeDocument/2006/math" xmlns:v="urn:schemas-microsoft-com:vml" xmlns:wp14="http://schemas.microsoft.com/office/word/2010/wordprocessingDrawing" xmlns:wp="http://schemas.openxmlformats.org/drawingml/2006/wordprocessingDrawing" xmlns:w10="urn:schemas-microsoft-com:office:word" xmlns:w="http://schemas.openxmlformats.org/wordprocessingml/2006/main" xmlns:w14="http://schemas.microsoft.com/office/word/2010/wordml" xmlns:w15="http://schemas.microsoft.com/office/word/2012/wordml" xmlns:w16cex="http://schemas.microsoft.com/office/word/2018/wordml/cex" xmlns:w16cid="http://schemas.microsoft.com/office/word/2016/wordml/cid" xmlns:w16="http://schemas.microsoft.com/office/word/2018/wordml" xmlns:w16sdtdh="http://schemas.microsoft.com/office/word/2020/wordml/sdtdatahash" xmlns:w16se="http://schemas.microsoft.com/office/word/2015/wordml/symex" xmlns:wpg="http://schemas.microsoft.com/office/word/2010/wordprocessingGroup" xmlns:wpi="http://schemas.microsoft.com/office/word/2010/wordprocessingInk" xmlns:wne="http://schemas.microsoft.com/office/word/2006/wordml" xmlns:wps="http://schemas.microsoft.com/office/word/2010/wordprocessingShape" mc:Ignorable="w14 w15 w16se w16cid w16 w16cex w16sdtdh wp14">
+<w:hdr xmlns:wpc="http://schemas.microsoft.com/office/word/2010/wordprocessingCanvas" xmlns:cx="http://schemas.microsoft.com/office/drawing/2014/chartex" xmlns:cx1="http://schemas.microsoft.com/office/drawing/2015/9/8/chartex" xmlns:cx2="http://schemas.microsoft.com/office/drawing/2015/10/21/chartex" xmlns:cx3="http://schemas.microsoft.com/office/drawing/2016/5/9/chartex" xmlns:cx4="http://schemas.microsoft.com/office/drawing/2016/5/10/chartex" xmlns:cx5="http://schemas.microsoft.com/office/drawing/2016/5/11/chartex" xmlns:cx6="http://schemas.microsoft.com/office/drawing/2016/5/12/chartex" xmlns:cx7="http://schemas.microsoft.com/office/drawing/2016/5/13/chartex" xmlns:cx8="http://schemas.microsoft.com/office/drawing/2016/5/14/chartex" xmlns:mc="http://schemas.openxmlformats.org/markup-compatibility/2006" xmlns:aink="http://schemas.microsoft.com/office/drawing/2016/ink" xmlns:am3d="http://schemas.microsoft.com/office/drawing/2017/model3d" xmlns:o="urn:schemas-microsoft-com:office:office" xmlns:oel="http://schemas.microsoft.com/office/2019/extlst" xmlns:r="http://schemas.openxmlformats.org/officeDocument/2006/relationships" xmlns:m="http://schemas.openxmlformats.org/officeDocument/2006/math" xmlns:v="urn:schemas-microsoft-com:vml" xmlns:wp14="http://schemas.microsoft.com/office/word/2010/wordprocessingDrawing" xmlns:wp="http://schemas.openxmlformats.org/drawingml/2006/wordprocessingDrawing" xmlns:w10="urn:schemas-microsoft-com:office:word" xmlns:w="http://schemas.openxmlformats.org/wordprocessingml/2006/main" xmlns:w14="http://schemas.microsoft.com/office/word/2010/wordml" xmlns:w15="http://schemas.microsoft.com/office/word/2012/wordml" xmlns:w16cex="http://schemas.microsoft.com/office/word/2018/wordml/cex" xmlns:w16cid="http://schemas.microsoft.com/office/word/2016/wordml/cid" xmlns:w16="http://schemas.microsoft.com/office/word/2018/wordml" xmlns:w16du="http://schemas.microsoft.com/office/word/2023/wordml/word16du" xmlns:w16sdtdh="http://schemas.microsoft.com/office/word/2020/wordml/sdtdatahash" xmlns:w16sdtfl="http://schemas.microsoft.com/office/word/2024/wordml/sdtformatlock" xmlns:w16se="http://schemas.microsoft.com/office/word/2015/wordml/symex" xmlns:wpg="http://schemas.microsoft.com/office/word/2010/wordprocessingGroup" xmlns:wpi="http://schemas.microsoft.com/office/word/2010/wordprocessingInk" xmlns:wne="http://schemas.microsoft.com/office/word/2006/wordml" xmlns:wps="http://schemas.microsoft.com/office/word/2010/wordprocessingShape" mc:Ignorable="w14 w15 w16se w16cid w16 w16cex w16sdtdh w16sdtfl w16du wp14">
   <w:tbl>
     <w:tblPr>
       <w:tblW w:w="9754" w:type="dxa"/>
@@ -5078,7 +5058,7 @@
 </file>
 
 <file path=word/numbering.xml><?xml version="1.0" encoding="utf-8"?>
-<w:numbering xmlns:wpc="http://schemas.microsoft.com/office/word/2010/wordprocessingCanvas" xmlns:cx="http://schemas.microsoft.com/office/drawing/2014/chartex" xmlns:cx1="http://schemas.microsoft.com/office/drawing/2015/9/8/chartex" xmlns:cx2="http://schemas.microsoft.com/office/drawing/2015/10/21/chartex" xmlns:cx3="http://schemas.microsoft.com/office/drawing/2016/5/9/chartex" xmlns:cx4="http://schemas.microsoft.com/office/drawing/2016/5/10/chartex" xmlns:cx5="http://schemas.microsoft.com/office/drawing/2016/5/11/chartex" xmlns:cx6="http://schemas.microsoft.com/office/drawing/2016/5/12/chartex" xmlns:cx7="http://schemas.microsoft.com/office/drawing/2016/5/13/chartex" xmlns:cx8="http://schemas.microsoft.com/office/drawing/2016/5/14/chartex" xmlns:mc="http://schemas.openxmlformats.org/markup-compatibility/2006" xmlns:aink="http://schemas.microsoft.com/office/drawing/2016/ink" xmlns:am3d="http://schemas.microsoft.com/office/drawing/2017/model3d" xmlns:o="urn:schemas-microsoft-com:office:office" xmlns:oel="http://schemas.microsoft.com/office/2019/extlst" xmlns:r="http://schemas.openxmlformats.org/officeDocument/2006/relationships" xmlns:m="http://schemas.openxmlformats.org/officeDocument/2006/math" xmlns:v="urn:schemas-microsoft-com:vml" xmlns:wp14="http://schemas.microsoft.com/office/word/2010/wordprocessingDrawing" xmlns:wp="http://schemas.openxmlformats.org/drawingml/2006/wordprocessingDrawing" xmlns:w10="urn:schemas-microsoft-com:office:word" xmlns:w="http://schemas.openxmlformats.org/wordprocessingml/2006/main" xmlns:w14="http://schemas.microsoft.com/office/word/2010/wordml" xmlns:w15="http://schemas.microsoft.com/office/word/2012/wordml" xmlns:w16cex="http://schemas.microsoft.com/office/word/2018/wordml/cex" xmlns:w16cid="http://schemas.microsoft.com/office/word/2016/wordml/cid" xmlns:w16="http://schemas.microsoft.com/office/word/2018/wordml" xmlns:w16sdtdh="http://schemas.microsoft.com/office/word/2020/wordml/sdtdatahash" xmlns:w16se="http://schemas.microsoft.com/office/word/2015/wordml/symex" xmlns:wpg="http://schemas.microsoft.com/office/word/2010/wordprocessingGroup" xmlns:wpi="http://schemas.microsoft.com/office/word/2010/wordprocessingInk" xmlns:wne="http://schemas.microsoft.com/office/word/2006/wordml" xmlns:wps="http://schemas.microsoft.com/office/word/2010/wordprocessingShape" mc:Ignorable="w14 w15 w16se w16cid w16 w16cex w16sdtdh wp14">
+<w:numbering xmlns:wpc="http://schemas.microsoft.com/office/word/2010/wordprocessingCanvas" xmlns:cx="http://schemas.microsoft.com/office/drawing/2014/chartex" xmlns:cx1="http://schemas.microsoft.com/office/drawing/2015/9/8/chartex" xmlns:cx2="http://schemas.microsoft.com/office/drawing/2015/10/21/chartex" xmlns:cx3="http://schemas.microsoft.com/office/drawing/2016/5/9/chartex" xmlns:cx4="http://schemas.microsoft.com/office/drawing/2016/5/10/chartex" xmlns:cx5="http://schemas.microsoft.com/office/drawing/2016/5/11/chartex" xmlns:cx6="http://schemas.microsoft.com/office/drawing/2016/5/12/chartex" xmlns:cx7="http://schemas.microsoft.com/office/drawing/2016/5/13/chartex" xmlns:cx8="http://schemas.microsoft.com/office/drawing/2016/5/14/chartex" xmlns:mc="http://schemas.openxmlformats.org/markup-compatibility/2006" xmlns:aink="http://schemas.microsoft.com/office/drawing/2016/ink" xmlns:am3d="http://schemas.microsoft.com/office/drawing/2017/model3d" xmlns:o="urn:schemas-microsoft-com:office:office" xmlns:oel="http://schemas.microsoft.com/office/2019/extlst" xmlns:r="http://schemas.openxmlformats.org/officeDocument/2006/relationships" xmlns:m="http://schemas.openxmlformats.org/officeDocument/2006/math" xmlns:v="urn:schemas-microsoft-com:vml" xmlns:wp14="http://schemas.microsoft.com/office/word/2010/wordprocessingDrawing" xmlns:wp="http://schemas.openxmlformats.org/drawingml/2006/wordprocessingDrawing" xmlns:w10="urn:schemas-microsoft-com:office:word" xmlns:w="http://schemas.openxmlformats.org/wordprocessingml/2006/main" xmlns:w14="http://schemas.microsoft.com/office/word/2010/wordml" xmlns:w15="http://schemas.microsoft.com/office/word/2012/wordml" xmlns:w16cex="http://schemas.microsoft.com/office/word/2018/wordml/cex" xmlns:w16cid="http://schemas.microsoft.com/office/word/2016/wordml/cid" xmlns:w16="http://schemas.microsoft.com/office/word/2018/wordml" xmlns:w16du="http://schemas.microsoft.com/office/word/2023/wordml/word16du" xmlns:w16sdtdh="http://schemas.microsoft.com/office/word/2020/wordml/sdtdatahash" xmlns:w16sdtfl="http://schemas.microsoft.com/office/word/2024/wordml/sdtformatlock" xmlns:w16se="http://schemas.microsoft.com/office/word/2015/wordml/symex" xmlns:wpg="http://schemas.microsoft.com/office/word/2010/wordprocessingGroup" xmlns:wpi="http://schemas.microsoft.com/office/word/2010/wordprocessingInk" xmlns:wne="http://schemas.microsoft.com/office/word/2006/wordml" xmlns:wps="http://schemas.microsoft.com/office/word/2010/wordprocessingShape" mc:Ignorable="w14 w15 w16se w16cid w16 w16cex w16sdtdh w16sdtfl w16du wp14">
   <w:abstractNum w:abstractNumId="0" w15:restartNumberingAfterBreak="0">
     <w:nsid w:val="04EC7F62"/>
     <w:multiLevelType w:val="hybridMultilevel"/>
@@ -8370,7 +8350,7 @@
 </file>
 
 <file path=word/styles.xml><?xml version="1.0" encoding="utf-8"?>
-<w:styles xmlns:mc="http://schemas.openxmlformats.org/markup-compatibility/2006" xmlns:r="http://schemas.openxmlformats.org/officeDocument/2006/relationships" xmlns:w="http://schemas.openxmlformats.org/wordprocessingml/2006/main" xmlns:w14="http://schemas.microsoft.com/office/word/2010/wordml" xmlns:w15="http://schemas.microsoft.com/office/word/2012/wordml" xmlns:w16cex="http://schemas.microsoft.com/office/word/2018/wordml/cex" xmlns:w16cid="http://schemas.microsoft.com/office/word/2016/wordml/cid" xmlns:w16="http://schemas.microsoft.com/office/word/2018/wordml" xmlns:w16sdtdh="http://schemas.microsoft.com/office/word/2020/wordml/sdtdatahash" xmlns:w16se="http://schemas.microsoft.com/office/word/2015/wordml/symex" mc:Ignorable="w14 w15 w16se w16cid w16 w16cex w16sdtdh">
+<w:styles xmlns:mc="http://schemas.openxmlformats.org/markup-compatibility/2006" xmlns:r="http://schemas.openxmlformats.org/officeDocument/2006/relationships" xmlns:w="http://schemas.openxmlformats.org/wordprocessingml/2006/main" xmlns:w14="http://schemas.microsoft.com/office/word/2010/wordml" xmlns:w15="http://schemas.microsoft.com/office/word/2012/wordml" xmlns:w16cex="http://schemas.microsoft.com/office/word/2018/wordml/cex" xmlns:w16cid="http://schemas.microsoft.com/office/word/2016/wordml/cid" xmlns:w16="http://schemas.microsoft.com/office/word/2018/wordml" xmlns:w16du="http://schemas.microsoft.com/office/word/2023/wordml/word16du" xmlns:w16sdtdh="http://schemas.microsoft.com/office/word/2020/wordml/sdtdatahash" xmlns:w16sdtfl="http://schemas.microsoft.com/office/word/2024/wordml/sdtformatlock" xmlns:w16se="http://schemas.microsoft.com/office/word/2015/wordml/symex" mc:Ignorable="w14 w15 w16se w16cid w16 w16cex w16sdtdh w16sdtfl w16du">
   <w:docDefaults>
     <w:rPrDefault>
       <w:rPr>
@@ -9862,6 +9842,23 @@
 </file>
 
 <file path=customXml/item1.xml><?xml version="1.0" encoding="utf-8"?>
+<?mso-contentType ?>
+<FormTemplates xmlns="http://schemas.microsoft.com/sharepoint/v3/contenttype/forms">
+  <Display>DocumentLibraryForm</Display>
+  <Edit>DocumentLibraryForm</Edit>
+  <New>DocumentLibraryForm</New>
+</FormTemplates>
+</file>
+
+<file path=customXml/item2.xml><?xml version="1.0" encoding="utf-8"?>
+<p:properties xmlns:p="http://schemas.microsoft.com/office/2006/metadata/properties" xmlns:xsi="http://www.w3.org/2001/XMLSchema-instance" xmlns:pc="http://schemas.microsoft.com/office/infopath/2007/PartnerControls">
+  <documentManagement>
+    <_activity xmlns="5050927d-c905-4765-a2b8-2c4fb84ebfbe" xsi:nil="true"/>
+  </documentManagement>
+</p:properties>
+</file>
+
+<file path=customXml/item3.xml><?xml version="1.0" encoding="utf-8"?>
 <ct:contentTypeSchema xmlns:ct="http://schemas.microsoft.com/office/2006/metadata/contentType" xmlns:ma="http://schemas.microsoft.com/office/2006/metadata/properties/metaAttributes" ct:_="" ma:_="" ma:contentTypeName="Document" ma:contentTypeID="0x010100398992936FBB084095783FF6DB990994" ma:contentTypeVersion="16" ma:contentTypeDescription="Crée un document." ma:contentTypeScope="" ma:versionID="e2e7299c93002442b16129ac7b1fe86d">
   <xsd:schema xmlns:xsd="http://www.w3.org/2001/XMLSchema" xmlns:xs="http://www.w3.org/2001/XMLSchema" xmlns:p="http://schemas.microsoft.com/office/2006/metadata/properties" xmlns:ns3="e8170872-c032-4720-8282-918eeb87723c" xmlns:ns4="5050927d-c905-4765-a2b8-2c4fb84ebfbe" targetNamespace="http://schemas.microsoft.com/office/2006/metadata/properties" ma:root="true" ma:fieldsID="a6770550efae6d0033fc4e01b8a67be5" ns3:_="" ns4:_="">
     <xsd:import namespace="e8170872-c032-4720-8282-918eeb87723c"/>
@@ -10100,24 +10097,25 @@
 </ct:contentTypeSchema>
 </file>
 
-<file path=customXml/item2.xml><?xml version="1.0" encoding="utf-8"?>
-<p:properties xmlns:p="http://schemas.microsoft.com/office/2006/metadata/properties" xmlns:xsi="http://www.w3.org/2001/XMLSchema-instance" xmlns:pc="http://schemas.microsoft.com/office/infopath/2007/PartnerControls">
-  <documentManagement>
-    <_activity xmlns="5050927d-c905-4765-a2b8-2c4fb84ebfbe" xsi:nil="true"/>
-  </documentManagement>
-</p:properties>
+<file path=customXml/itemProps1.xml><?xml version="1.0" encoding="utf-8"?>
+<ds:datastoreItem xmlns:ds="http://schemas.openxmlformats.org/officeDocument/2006/customXml" ds:itemID="{649F966D-34B2-4A24-8ABC-37FCF87BB969}">
+  <ds:schemaRefs>
+    <ds:schemaRef ds:uri="http://schemas.microsoft.com/sharepoint/v3/contenttype/forms"/>
+  </ds:schemaRefs>
+</ds:datastoreItem>
 </file>
 
-<file path=customXml/item3.xml><?xml version="1.0" encoding="utf-8"?>
-<?mso-contentType ?>
-<FormTemplates xmlns="http://schemas.microsoft.com/sharepoint/v3/contenttype/forms">
-  <Display>DocumentLibraryForm</Display>
-  <Edit>DocumentLibraryForm</Edit>
-  <New>DocumentLibraryForm</New>
-</FormTemplates>
+<file path=customXml/itemProps2.xml><?xml version="1.0" encoding="utf-8"?>
+<ds:datastoreItem xmlns:ds="http://schemas.openxmlformats.org/officeDocument/2006/customXml" ds:itemID="{1FEC9E11-7618-49B0-B2CE-A821B0FF7151}">
+  <ds:schemaRefs>
+    <ds:schemaRef ds:uri="http://schemas.microsoft.com/office/2006/metadata/properties"/>
+    <ds:schemaRef ds:uri="http://schemas.microsoft.com/office/infopath/2007/PartnerControls"/>
+    <ds:schemaRef ds:uri="5050927d-c905-4765-a2b8-2c4fb84ebfbe"/>
+  </ds:schemaRefs>
+</ds:datastoreItem>
 </file>
 
-<file path=customXml/itemProps1.xml><?xml version="1.0" encoding="utf-8"?>
+<file path=customXml/itemProps3.xml><?xml version="1.0" encoding="utf-8"?>
 <ds:datastoreItem xmlns:ds="http://schemas.openxmlformats.org/officeDocument/2006/customXml" ds:itemID="{D694F897-DAE7-4A26-BB50-75C0E4ED0ED3}">
   <ds:schemaRefs>
     <ds:schemaRef ds:uri="http://schemas.microsoft.com/office/2006/metadata/contentType"/>
@@ -10134,22 +10132,4 @@
     <ds:schemaRef ds:uri="http://schemas.microsoft.com/internal/obd"/>
   </ds:schemaRefs>
 </ds:datastoreItem>
-</file>
-
-<file path=customXml/itemProps2.xml><?xml version="1.0" encoding="utf-8"?>
-<ds:datastoreItem xmlns:ds="http://schemas.openxmlformats.org/officeDocument/2006/customXml" ds:itemID="{1FEC9E11-7618-49B0-B2CE-A821B0FF7151}">
-  <ds:schemaRefs>
-    <ds:schemaRef ds:uri="http://schemas.microsoft.com/office/2006/metadata/properties"/>
-    <ds:schemaRef ds:uri="http://schemas.microsoft.com/office/infopath/2007/PartnerControls"/>
-    <ds:schemaRef ds:uri="5050927d-c905-4765-a2b8-2c4fb84ebfbe"/>
-  </ds:schemaRefs>
-</ds:datastoreItem>
-</file>
-
-<file path=customXml/itemProps3.xml><?xml version="1.0" encoding="utf-8"?>
-<ds:datastoreItem xmlns:ds="http://schemas.openxmlformats.org/officeDocument/2006/customXml" ds:itemID="{649F966D-34B2-4A24-8ABC-37FCF87BB969}">
-  <ds:schemaRefs>
-    <ds:schemaRef ds:uri="http://schemas.microsoft.com/sharepoint/v3/contenttype/forms"/>
-  </ds:schemaRefs>
-</ds:datastoreItem>
 </file>
</xml_diff>